<commit_message>
Backend and docuemnt update
</commit_message>
<xml_diff>
--- a/Documents/DiscoverSalah_Proposal.docx
+++ b/Documents/DiscoverSalah_Proposal.docx
@@ -5,6 +5,98 @@
     <w:p>
       <w:pPr>
         <w:pStyle w:val="Title"/>
+      </w:pPr>
+      <w:r>
+        <w:rPr>
+          <w:rFonts w:ascii="Calibri" w:hAnsi="Calibri"/>
+          <w:color w:val="000000"/>
+          <w:sz w:val="44"/>
+        </w:rPr>
+        <w:t>Current release baseline</w:t>
+      </w:r>
+    </w:p>
+    <w:p>
+      <w:pPr>
+        <w:pStyle w:val="CurrentReleaseBody"/>
+      </w:pPr>
+      <w:r>
+        <w:t>22 October 2026</w:t>
+      </w:r>
+    </w:p>
+    <w:p>
+      <w:pPr>
+        <w:pStyle w:val="CurrentReleaseBody"/>
+      </w:pPr>
+      <w:r>
+        <w:rPr>
+          <w:b/>
+        </w:rPr>
+        <w:t xml:space="preserve">Scope. </w:t>
+      </w:r>
+      <w:r>
+        <w:t>This revision governs the current local system. The existing requirement and screen identifiers are retained. Earlier diagrams, endpoint sketches and routing algorithms are historical or deferred wherever they conflict with this baseline.</w:t>
+      </w:r>
+    </w:p>
+    <w:p>
+      <w:pPr>
+        <w:pStyle w:val="CurrentReleaseBody"/>
+      </w:pPr>
+      <w:r>
+        <w:rPr>
+          <w:b/>
+        </w:rPr>
+        <w:t xml:space="preserve">Navigation. </w:t>
+      </w:r>
+      <w:r>
+        <w:t>External Google Maps URLs are the selected no-key approach. A user click sends only a published mosque entrance and walking or two-wheeler mode. No embedded map, Google API billing, visitor origin, private contact or route-duration response is involved. Directions work without a scheduled session. The app makes no arrival-time or reachability calculation.</w:t>
+      </w:r>
+    </w:p>
+    <w:p>
+      <w:pPr>
+        <w:pStyle w:val="CurrentReleaseBody"/>
+      </w:pPr>
+      <w:r>
+        <w:rPr>
+          <w:b/>
+        </w:rPr>
+        <w:t xml:space="preserve">Accounts and trust. </w:t>
+      </w:r>
+      <w:r>
+        <w:t>Only Admin issues focal credentials; only the responsible focal person issues representative credentials. Contact details are confirmed independently by the issuer. Temporary passwords expire after 24 hours and require a first-login change. No SMS OTP or verified-email recovery is required. Administrator MFA uses free local TOTP and single-use recovery codes. Imam phone-call evidence remains a separate timetable-verification process.</w:t>
+      </w:r>
+    </w:p>
+    <w:p>
+      <w:pPr>
+        <w:pStyle w:val="CurrentReleaseBody"/>
+      </w:pPr>
+      <w:r>
+        <w:rPr>
+          <w:b/>
+        </w:rPr>
+        <w:t xml:space="preserve">Implementation. </w:t>
+      </w:r>
+      <w:r>
+        <w:t>React/TypeScript frontend, Express API and a separate worker use persistent MongoDB. Authorization, revisions, audit and outbox writes are enforced on the server. Public responses exclude private contacts. Local ports are 5173 for the frontend and 4000 for the API; production hosting is not provisioned.</w:t>
+      </w:r>
+    </w:p>
+    <w:p>
+      <w:pPr>
+        <w:pStyle w:val="CurrentReleaseBody"/>
+      </w:pPr>
+      <w:r>
+        <w:rPr>
+          <w:b/>
+        </w:rPr>
+        <w:t xml:space="preserve">Acceptance boundaries. </w:t>
+      </w:r>
+      <w:r>
+        <w:t>The core local flows have automated and mobile-viewport browser coverage. Large-scale pagination, full Urdu copy review, combined registration resubmission, production recovery/load acceptance and physical old-Android validation remain outstanding. Google API routing and forecasts are deferred. See Documents/CURRENT_SYSTEM.md and backend/docs/IMPLEMENTATION_REPORT.md for the maintained implementation record.</w:t>
+      </w:r>
+    </w:p>
+    <w:p>
+      <w:pPr>
+        <w:pStyle w:val="Title"/>
+        <w:pageBreakBefore/>
       </w:pPr>
       <w:r>
         <w:t>DiscoverSalah Project Proposal</w:t>
@@ -1082,13 +1174,29 @@
       </w:r>
     </w:p>
     <w:p>
+      <w:commentRangeStart w:id="0"/>
       <w:r>
-        <w:t>Deliver a mobile-friendly web application with Urdu and English interfaces, mosque lists and maps, manual and device location, Walking and Motorcycle modes, Nearby and Whole City search, daily schedules, multiple Jumu’ah sessions, dated Eid sessions, countdowns, estimated arrival margins and directions. Include basic confirmed facility details, announcements and public reporting.</w:t>
+        <w:t>Current local release: a responsive Urdu/English React web application with participating mosque lists, location controls, Nearby and Whole City discovery, daily and dated Jama’at schedules, public reporting and external Google Maps directions. No embedded live map, route duration, arrival margin or arrive-before-Jama’at ranking is enabled. Some newly integrated account/tracking text still needs Urdu review.</w:t>
+      </w:r>
+      <w:commentRangeEnd w:id="0"/>
+      <w:r>
+        <w:rPr>
+          <w:rStyle w:val="CommentReference"/>
+        </w:rPr>
+        <w:commentReference w:id="0"/>
       </w:r>
     </w:p>
     <w:p>
+      <w:commentRangeStart w:id="1"/>
       <w:r>
-        <w:t>Management capabilities include three scoped dashboards, mosque registration, private Imam contacts, versioned schedule submissions, durable account notifications, phone-verification decisions, reminders, escalation, reassignment, freshness monitoring and audit history. The first release supports future departure planning with clearly qualified estimates. Native apps, car routing and automated timetable extraction can follow after the operating model is proven.</w:t>
+        <w:t>Management uses scoped representative, focal-person and administrator workspaces backed by the API and MongoDB. Registration, private Imam contacts, immutable timing submissions, independent review, in-app notifications, reassignment, escalation and audit history are implemented. Future-departure forecasts, native apps, paid routing and external SMS/email delivery are outside the current local release.</w:t>
+      </w:r>
+      <w:commentRangeEnd w:id="1"/>
+      <w:r>
+        <w:rPr>
+          <w:rStyle w:val="CommentReference"/>
+        </w:rPr>
+        <w:commentReference w:id="1"/>
       </w:r>
     </w:p>
     <w:p>
@@ -1100,13 +1208,29 @@
       </w:r>
     </w:p>
     <w:p>
+      <w:commentRangeStart w:id="2"/>
       <w:r>
-        <w:t>Retain the original proposal’s React web frontend, Node.js and Express backend, and MongoDB geospatial data model as the baseline, subject to implementation review. Separate discovery, schedules, identity and authorization, verification, reporting and notifications into clear modules. A routing adapter should allow provider replacement without changing business rules.</w:t>
+        <w:t>Implemented architecture: React and TypeScript frontend; Node.js and Express modular API; persistent transaction-capable MongoDB; separate outbox and retention worker. Modules separate authentication, venues, timetables, community, notices and administration. Server commands enforce authorization and persistence; browser fixtures are not runtime records.</w:t>
+      </w:r>
+      <w:commentRangeEnd w:id="2"/>
+      <w:r>
+        <w:rPr>
+          <w:rStyle w:val="CommentReference"/>
+        </w:rPr>
+        <w:commentReference w:id="2"/>
       </w:r>
     </w:p>
     <w:p>
+      <w:commentRangeStart w:id="3"/>
       <w:r>
-        <w:t>Map rendering, map tiles, geocoding, route estimation and external navigation are separate dependencies with separate capacity and cost considerations. Select production service arrangements after evaluating the launch city; do not assume map display also provides motorcycle travel estimates or unrestricted infrastructure.</w:t>
+        <w:t>Selected navigation approach: Google Maps URLs open externally after a user click, without an API key, billing account, embedded SDK or route API. The URL contains the published entrance coordinates and walking or two-wheeler mode, never the visitor’s precise origin. Google Maps handles the starting point and supported directions. DiscoverSalah receives no route duration or navigation result.</w:t>
+      </w:r>
+      <w:commentRangeEnd w:id="3"/>
+      <w:r>
+        <w:rPr>
+          <w:rStyle w:val="CommentReference"/>
+        </w:rPr>
+        <w:commentReference w:id="3"/>
       </w:r>
     </w:p>
     <w:tbl>
@@ -1636,8 +1760,16 @@
       </w:r>
     </w:p>
     <w:p>
+      <w:commentRangeStart w:id="4"/>
       <w:r>
-        <w:t>Approval must refer to the exact version reviewed. Concurrent edits cannot silently overwrite each other. Persist schedule decisions and their notification work reliably so retries do not create duplicate approvals or tasks. Cache route estimates by origin, destination, mode and relevant time window; expire them appropriately. City-wide lists use pagination and map clustering while retaining access to all matching records.</w:t>
+        <w:t>Approval refers to the reviewed immutable version. Transactions, current-account checks, expected revisions, idempotency and durable outbox records protect concurrent writes. The current compatibility workspace is bounded to 200 venues and 1,000 proposals with smaller supporting feeds; per-screen pagination is required before larger deployment. Route caching and clustered embedded maps remain deferred design.</w:t>
+      </w:r>
+      <w:commentRangeEnd w:id="4"/>
+      <w:r>
+        <w:rPr>
+          <w:rStyle w:val="CommentReference"/>
+        </w:rPr>
+        <w:commentReference w:id="4"/>
       </w:r>
     </w:p>
     <w:p>
@@ -1680,13 +1812,29 @@
       </w:r>
     </w:p>
     <w:p>
+      <w:commentRangeStart w:id="5"/>
       <w:r>
-        <w:t>Use secure password hashing, encrypted transport, scoped authorization, login throttling, secure session handling and revocation on deactivation or reassignment. Administrative accounts should have an additional authentication factor. Initial credentials require a first-use change, and recovery must verify the account owner. Never include Imam numbers in public APIs, analytics events or broad exports.</w:t>
+        <w:t>Accounts use contact-number/password authentication. Only Admin issues focal-person credentials; only the responsible focal person issues representative credentials in their assigned areas. The issuer independently confirms identity and contact details. Temporary passwords expire after 24 hours and require a first-use change. Issuer resets and contact-number changes revoke sessions. No SMS OTP or verified email is required. Administrator TOTP and single-use recovery codes provide MFA.</w:t>
+      </w:r>
+      <w:commentRangeEnd w:id="5"/>
+      <w:r>
+        <w:rPr>
+          <w:rStyle w:val="CommentReference"/>
+        </w:rPr>
+        <w:commentReference w:id="5"/>
       </w:r>
     </w:p>
     <w:p>
+      <w:commentRangeStart w:id="6"/>
       <w:r>
-        <w:t>Avoid persistent storage of precise public-user locations unless justified and consented to. Disclose location sharing with routing providers. Restrict verification notes and audit access. Validate submitted times, effective dates, coordinates and account scope on the server. Define retention, backup access and restoration procedures before launch.</w:t>
+        <w:t>Sensitive contacts and evidence are encrypted and excluded from public DTOs. Precise visitor location remains in memory and is not included in external Maps links. Origin/CSRF checks, body limits, rate limits and server schemas guard commands. Closed rejected/withdrawn applications are redacted after 90 days; production backups, restore rehearsal and key rotation remain outstanding.</w:t>
+      </w:r>
+      <w:commentRangeEnd w:id="6"/>
+      <w:r>
+        <w:rPr>
+          <w:rStyle w:val="CommentReference"/>
+        </w:rPr>
+        <w:commentReference w:id="6"/>
       </w:r>
     </w:p>
     <w:p>
@@ -2282,6 +2430,123 @@
 </w:document>
 </file>
 
+<file path=word/comments.xml><?xml version="1.0" encoding="utf-8"?>
+<w:comments xmlns:a="http://schemas.openxmlformats.org/drawingml/2006/main" xmlns:pic="http://schemas.openxmlformats.org/drawingml/2006/picture" xmlns:r="http://schemas.openxmlformats.org/officeDocument/2006/relationships" xmlns:w="http://schemas.openxmlformats.org/wordprocessingml/2006/main" xmlns:wp="http://schemas.openxmlformats.org/drawingml/2006/wordprocessingDrawing" xmlns:mc="http://schemas.openxmlformats.org/markup-compatibility/2006" xmlns:a14="http://schemas.microsoft.com/office/drawing/2010/main" xmlns:w14="http://schemas.microsoft.com/office/word/2010/wordml" xmlns:wpc="http://schemas.microsoft.com/office/word/2010/wordprocessingCanvas">
+  <w:comment w:id="0" w:author="DiscoverSalah" w:initials="DS" w:date="2026-10-22T09:21:50Z">
+    <w:p>
+      <w:pPr>
+        <w:pStyle w:val="CommentText"/>
+      </w:pPr>
+      <w:r>
+        <w:rPr>
+          <w:rStyle w:val="CommentReference"/>
+        </w:rPr>
+        <w:annotationRef/>
+      </w:r>
+      <w:r>
+        <w:t>22 October 2026 implementation revision. This replaces the earlier planned behavior with the current local release. The original document is preserved in .project-reference/original-documents-2026-10-22.</w:t>
+      </w:r>
+    </w:p>
+  </w:comment>
+  <w:comment w:id="1" w:author="DiscoverSalah" w:initials="DS" w:date="2026-10-22T09:21:50Z">
+    <w:p>
+      <w:pPr>
+        <w:pStyle w:val="CommentText"/>
+      </w:pPr>
+      <w:r>
+        <w:rPr>
+          <w:rStyle w:val="CommentReference"/>
+        </w:rPr>
+        <w:annotationRef/>
+      </w:r>
+      <w:r>
+        <w:t>22 October 2026 implementation revision. This replaces the earlier planned behavior with the current local release. The original document is preserved in .project-reference/original-documents-2026-10-22.</w:t>
+      </w:r>
+    </w:p>
+  </w:comment>
+  <w:comment w:id="2" w:author="DiscoverSalah" w:initials="DS" w:date="2026-10-22T09:21:50Z">
+    <w:p>
+      <w:pPr>
+        <w:pStyle w:val="CommentText"/>
+      </w:pPr>
+      <w:r>
+        <w:rPr>
+          <w:rStyle w:val="CommentReference"/>
+        </w:rPr>
+        <w:annotationRef/>
+      </w:r>
+      <w:r>
+        <w:t>22 October 2026 implementation revision. This replaces the earlier planned behavior with the current local release. The original document is preserved in .project-reference/original-documents-2026-10-22.</w:t>
+      </w:r>
+    </w:p>
+  </w:comment>
+  <w:comment w:id="3" w:author="DiscoverSalah" w:initials="DS" w:date="2026-10-22T09:21:50Z">
+    <w:p>
+      <w:pPr>
+        <w:pStyle w:val="CommentText"/>
+      </w:pPr>
+      <w:r>
+        <w:rPr>
+          <w:rStyle w:val="CommentReference"/>
+        </w:rPr>
+        <w:annotationRef/>
+      </w:r>
+      <w:r>
+        <w:t>22 October 2026 implementation revision. This replaces the earlier planned behavior with the current local release. The original document is preserved in .project-reference/original-documents-2026-10-22.</w:t>
+      </w:r>
+    </w:p>
+  </w:comment>
+  <w:comment w:id="4" w:author="DiscoverSalah" w:initials="DS" w:date="2026-10-22T09:21:50Z">
+    <w:p>
+      <w:pPr>
+        <w:pStyle w:val="CommentText"/>
+      </w:pPr>
+      <w:r>
+        <w:rPr>
+          <w:rStyle w:val="CommentReference"/>
+        </w:rPr>
+        <w:annotationRef/>
+      </w:r>
+      <w:r>
+        <w:t>22 October 2026 implementation revision. This replaces the earlier planned behavior with the current local release. The original document is preserved in .project-reference/original-documents-2026-10-22.</w:t>
+      </w:r>
+    </w:p>
+  </w:comment>
+  <w:comment w:id="5" w:author="DiscoverSalah" w:initials="DS" w:date="2026-10-22T09:21:50Z">
+    <w:p>
+      <w:pPr>
+        <w:pStyle w:val="CommentText"/>
+      </w:pPr>
+      <w:r>
+        <w:rPr>
+          <w:rStyle w:val="CommentReference"/>
+        </w:rPr>
+        <w:annotationRef/>
+      </w:r>
+      <w:r>
+        <w:t>22 October 2026 implementation revision. This replaces the earlier planned behavior with the current local release. The original document is preserved in .project-reference/original-documents-2026-10-22.</w:t>
+      </w:r>
+    </w:p>
+  </w:comment>
+  <w:comment w:id="6" w:author="DiscoverSalah" w:initials="DS" w:date="2026-10-22T09:21:50Z">
+    <w:p>
+      <w:pPr>
+        <w:pStyle w:val="CommentText"/>
+      </w:pPr>
+      <w:r>
+        <w:rPr>
+          <w:rStyle w:val="CommentReference"/>
+        </w:rPr>
+        <w:annotationRef/>
+      </w:r>
+      <w:r>
+        <w:t>22 October 2026 implementation revision. This replaces the earlier planned behavior with the current local release. The original document is preserved in .project-reference/original-documents-2026-10-22.</w:t>
+      </w:r>
+    </w:p>
+  </w:comment>
+</w:comments>
+</file>
+
 <file path=word/footer1.xml><?xml version="1.0" encoding="utf-8"?>
 <w:ftr xmlns:m="http://schemas.openxmlformats.org/officeDocument/2006/math" xmlns:mc="http://schemas.openxmlformats.org/markup-compatibility/2006" xmlns:mo="http://schemas.microsoft.com/office/mac/office/2008/main" xmlns:mv="urn:schemas-microsoft-com:mac:vml" xmlns:o="urn:schemas-microsoft-com:office:office" xmlns:r="http://schemas.openxmlformats.org/officeDocument/2006/relationships" xmlns:v="urn:schemas-microsoft-com:vml" xmlns:w10="urn:schemas-microsoft-com:office:word" xmlns:w14="http://schemas.microsoft.com/office/word/2010/wordml" xmlns:w="http://schemas.openxmlformats.org/wordprocessingml/2006/main" xmlns:wne="http://schemas.microsoft.com/office/word/2006/wordml" xmlns:wp14="http://schemas.microsoft.com/office/word/2010/wordprocessingDrawing" xmlns:wp="http://schemas.openxmlformats.org/drawingml/2006/wordprocessingDrawing" xmlns:wpc="http://schemas.microsoft.com/office/word/2010/wordprocessingCanvas" xmlns:wpg="http://schemas.microsoft.com/office/word/2010/wordprocessingGroup" xmlns:wpi="http://schemas.microsoft.com/office/word/2010/wordprocessingInk" xmlns:wps="http://schemas.microsoft.com/office/word/2010/wordprocessingShape" mc:Ignorable="w14 wp14">
   <w:p>
@@ -14368,6 +14633,17 @@
         <w:shd w:val="clear" w:color="auto" w:fill="FBCAA2" w:themeFill="accent6" w:themeFillTint="7F"/>
       </w:tcPr>
     </w:tblStylePr>
+  </w:style>
+  <w:style w:type="paragraph" w:customStyle="1" w:styleId="CurrentReleaseBody">
+    <w:name w:val="Current Release Body"/>
+    <w:pPr>
+      <w:spacing w:after="160" w:line="259" w:lineRule="auto"/>
+    </w:pPr>
+    <w:rPr>
+      <w:rFonts w:ascii="Calibri" w:hAnsi="Calibri"/>
+      <w:color w:val="000000"/>
+      <w:sz w:val="22"/>
+    </w:rPr>
   </w:style>
 </w:styles>
 </file>

</xml_diff>